<commit_message>
Fit poster figures on A3 pages and repeat table headers.
Keep each original poster on a single landscape page with its caption,
and repeat resource-table header rows when tables span multiple pages.

Co-authored-by: FrankBooom <FrankBooom@users.noreply.github.com>
</commit_message>
<xml_diff>
--- a/CHL-C-ROB08_工业机器人离线编程.docx
+++ b/CHL-C-ROB08_工业机器人离线编程.docx
@@ -451,6 +451,9 @@
         <w:gridCol w:w="3289"/>
       </w:tblGrid>
       <w:tr>
+        <w:trPr>
+          <w:tblHeader w:val="true"/>
+        </w:trPr>
         <w:tc>
           <w:tcPr>
             <w:tcW w:type="dxa" w:w="3118"/>
@@ -828,6 +831,9 @@
         <w:gridCol w:w="3289"/>
       </w:tblGrid>
       <w:tr>
+        <w:trPr>
+          <w:tblHeader w:val="true"/>
+        </w:trPr>
         <w:tc>
           <w:tcPr>
             <w:tcW w:type="dxa" w:w="3118"/>
@@ -1727,6 +1733,9 @@
         <w:gridCol w:w="3289"/>
       </w:tblGrid>
       <w:tr>
+        <w:trPr>
+          <w:tblHeader w:val="true"/>
+        </w:trPr>
         <w:tc>
           <w:tcPr>
             <w:tcW w:type="dxa" w:w="3118"/>
@@ -2191,6 +2200,9 @@
         <w:gridCol w:w="3289"/>
       </w:tblGrid>
       <w:tr>
+        <w:trPr>
+          <w:tblHeader w:val="true"/>
+        </w:trPr>
         <w:tc>
           <w:tcPr>
             <w:tcW w:type="dxa" w:w="3118"/>
@@ -3699,6 +3711,9 @@
         <w:gridCol w:w="3289"/>
       </w:tblGrid>
       <w:tr>
+        <w:trPr>
+          <w:tblHeader w:val="true"/>
+        </w:trPr>
         <w:tc>
           <w:tcPr>
             <w:tcW w:type="dxa" w:w="3118"/>
@@ -6424,12 +6439,27 @@
     </w:p>
     <w:p>
       <w:pPr>
+        <w:spacing w:after="120"/>
+        <w:jc w:val="center"/>
+      </w:pPr>
+      <w:r>
+        <w:rPr>
+          <w:rFonts w:ascii="Calibri" w:hAnsi="Calibri" w:eastAsia="微软雅黑" w:cs="Calibri"/>
+          <w:b w:val="0"/>
+          <w:color w:val="1F5FA8"/>
+          <w:sz w:val="20"/>
+        </w:rPr>
+        <w:t>附图 1  原海报第 1 页（课程概述与第一至四章资源清单）</w:t>
+      </w:r>
+    </w:p>
+    <w:p>
+      <w:pPr>
         <w:jc w:val="center"/>
       </w:pPr>
       <w:r>
         <w:drawing>
           <wp:inline xmlns:a="http://schemas.openxmlformats.org/drawingml/2006/main" xmlns:pic="http://schemas.openxmlformats.org/drawingml/2006/picture">
-            <wp:extent cx="14184000" cy="10477938"/>
+            <wp:extent cx="12085847" cy="8928000"/>
             <wp:docPr id="1" name="Picture 1"/>
             <wp:cNvGraphicFramePr>
               <a:graphicFrameLocks noChangeAspect="1"/>
@@ -6450,7 +6480,7 @@
                   <pic:spPr>
                     <a:xfrm>
                       <a:off x="0" y="0"/>
-                      <a:ext cx="14184000" cy="10477938"/>
+                      <a:ext cx="12085847" cy="8928000"/>
                     </a:xfrm>
                     <a:prstGeom prst="rect"/>
                   </pic:spPr>
@@ -6459,20 +6489,6 @@
             </a:graphic>
           </wp:inline>
         </w:drawing>
-      </w:r>
-    </w:p>
-    <w:p>
-      <w:pPr>
-        <w:jc w:val="center"/>
-      </w:pPr>
-      <w:r>
-        <w:rPr>
-          <w:rFonts w:ascii="Calibri" w:hAnsi="Calibri" w:eastAsia="微软雅黑" w:cs="Calibri"/>
-          <w:b w:val="0"/>
-          <w:color w:val="1F5FA8"/>
-          <w:sz w:val="20"/>
-        </w:rPr>
-        <w:t>附图 1  原海报第 1 页（课程概述与第一至四章资源清单）</w:t>
       </w:r>
     </w:p>
     <w:p>
@@ -6487,12 +6503,27 @@
     </w:p>
     <w:p>
       <w:pPr>
+        <w:spacing w:after="120"/>
+        <w:jc w:val="center"/>
+      </w:pPr>
+      <w:r>
+        <w:rPr>
+          <w:rFonts w:ascii="Calibri" w:hAnsi="Calibri" w:eastAsia="微软雅黑" w:cs="Calibri"/>
+          <w:b w:val="0"/>
+          <w:color w:val="1F5FA8"/>
+          <w:sz w:val="20"/>
+        </w:rPr>
+        <w:t>附图 2  原海报第 2 页（第五章资源清单）</w:t>
+      </w:r>
+    </w:p>
+    <w:p>
+      <w:pPr>
         <w:jc w:val="center"/>
       </w:pPr>
       <w:r>
         <w:drawing>
           <wp:inline xmlns:a="http://schemas.openxmlformats.org/drawingml/2006/main" xmlns:pic="http://schemas.openxmlformats.org/drawingml/2006/picture">
-            <wp:extent cx="14184000" cy="10477938"/>
+            <wp:extent cx="12085847" cy="8928000"/>
             <wp:docPr id="2" name="Picture 2"/>
             <wp:cNvGraphicFramePr>
               <a:graphicFrameLocks noChangeAspect="1"/>
@@ -6513,7 +6544,7 @@
                   <pic:spPr>
                     <a:xfrm>
                       <a:off x="0" y="0"/>
-                      <a:ext cx="14184000" cy="10477938"/>
+                      <a:ext cx="12085847" cy="8928000"/>
                     </a:xfrm>
                     <a:prstGeom prst="rect"/>
                   </pic:spPr>
@@ -6522,20 +6553,6 @@
             </a:graphic>
           </wp:inline>
         </w:drawing>
-      </w:r>
-    </w:p>
-    <w:p>
-      <w:pPr>
-        <w:jc w:val="center"/>
-      </w:pPr>
-      <w:r>
-        <w:rPr>
-          <w:rFonts w:ascii="Calibri" w:hAnsi="Calibri" w:eastAsia="微软雅黑" w:cs="Calibri"/>
-          <w:b w:val="0"/>
-          <w:color w:val="1F5FA8"/>
-          <w:sz w:val="20"/>
-        </w:rPr>
-        <w:t>附图 2  原海报第 2 页（第五章资源清单）</w:t>
       </w:r>
     </w:p>
     <w:sectPr>

</xml_diff>

<commit_message>
Put a 1:1 poster conversion on the first two Word pages.
The scanned PDF has no extractable text, so the Word file now opens
with the original two poster pages, followed by the editable PQArt
resource list.

Co-authored-by: FrankBooom <FrankBooom@users.noreply.github.com>
</commit_message>
<xml_diff>
--- a/CHL-C-ROB08_工业机器人离线编程.docx
+++ b/CHL-C-ROB08_工业机器人离线编程.docx
@@ -2,6 +2,106 @@
 <file path=word/document.xml><?xml version="1.0" encoding="utf-8"?>
 <w:document xmlns:wpc="http://schemas.microsoft.com/office/word/2010/wordprocessingCanvas" xmlns:mo="http://schemas.microsoft.com/office/mac/office/2008/main" xmlns:mc="http://schemas.openxmlformats.org/markup-compatibility/2006" xmlns:mv="urn:schemas-microsoft-com:mac:vml" xmlns:o="urn:schemas-microsoft-com:office:office" xmlns:r="http://schemas.openxmlformats.org/officeDocument/2006/relationships" xmlns:m="http://schemas.openxmlformats.org/officeDocument/2006/math" xmlns:v="urn:schemas-microsoft-com:vml" xmlns:wp14="http://schemas.microsoft.com/office/word/2010/wordprocessingDrawing" xmlns:wp="http://schemas.openxmlformats.org/drawingml/2006/wordprocessingDrawing" xmlns:w10="urn:schemas-microsoft-com:office:word" xmlns:w="http://schemas.openxmlformats.org/wordprocessingml/2006/main" xmlns:w14="http://schemas.microsoft.com/office/word/2010/wordml" xmlns:wpg="http://schemas.microsoft.com/office/word/2010/wordprocessingGroup" xmlns:wpi="http://schemas.microsoft.com/office/word/2010/wordprocessingInk" xmlns:wne="http://schemas.microsoft.com/office/word/2006/wordml" xmlns:wps="http://schemas.microsoft.com/office/word/2010/wordprocessingShape" mc:Ignorable="w14 wp14">
   <w:body>
+    <w:p>
+      <w:pPr>
+        <w:spacing w:before="0" w:after="0"/>
+        <w:jc w:val="center"/>
+      </w:pPr>
+      <w:r>
+        <w:drawing>
+          <wp:inline xmlns:a="http://schemas.openxmlformats.org/drawingml/2006/main" xmlns:pic="http://schemas.openxmlformats.org/drawingml/2006/picture">
+            <wp:extent cx="13888978" cy="10260000"/>
+            <wp:docPr id="1" name="Picture 1"/>
+            <wp:cNvGraphicFramePr>
+              <a:graphicFrameLocks noChangeAspect="1"/>
+            </wp:cNvGraphicFramePr>
+            <a:graphic>
+              <a:graphicData uri="http://schemas.openxmlformats.org/drawingml/2006/picture">
+                <pic:pic>
+                  <pic:nvPicPr>
+                    <pic:cNvPr id="0" name="page1.jpg"/>
+                    <pic:cNvPicPr/>
+                  </pic:nvPicPr>
+                  <pic:blipFill>
+                    <a:blip r:embed="rId9"/>
+                    <a:stretch>
+                      <a:fillRect/>
+                    </a:stretch>
+                  </pic:blipFill>
+                  <pic:spPr>
+                    <a:xfrm>
+                      <a:off x="0" y="0"/>
+                      <a:ext cx="13888978" cy="10260000"/>
+                    </a:xfrm>
+                    <a:prstGeom prst="rect"/>
+                  </pic:spPr>
+                </pic:pic>
+              </a:graphicData>
+            </a:graphic>
+          </wp:inline>
+        </w:drawing>
+      </w:r>
+    </w:p>
+    <w:p>
+      <w:pPr>
+        <w:sectPr>
+          <w:pgSz w:w="23811" w:h="16838"/>
+          <w:pgMar w:top="283" w:right="283" w:bottom="283" w:left="283" w:header="170" w:footer="170" w:gutter="0"/>
+          <w:cols w:space="720"/>
+          <w:docGrid w:linePitch="360"/>
+        </w:sectPr>
+      </w:pPr>
+    </w:p>
+    <w:p>
+      <w:pPr>
+        <w:spacing w:before="0" w:after="0"/>
+        <w:jc w:val="center"/>
+      </w:pPr>
+      <w:r>
+        <w:drawing>
+          <wp:inline xmlns:a="http://schemas.openxmlformats.org/drawingml/2006/main" xmlns:pic="http://schemas.openxmlformats.org/drawingml/2006/picture">
+            <wp:extent cx="13888978" cy="10260000"/>
+            <wp:docPr id="2" name="Picture 2"/>
+            <wp:cNvGraphicFramePr>
+              <a:graphicFrameLocks noChangeAspect="1"/>
+            </wp:cNvGraphicFramePr>
+            <a:graphic>
+              <a:graphicData uri="http://schemas.openxmlformats.org/drawingml/2006/picture">
+                <pic:pic>
+                  <pic:nvPicPr>
+                    <pic:cNvPr id="0" name="page2.jpg"/>
+                    <pic:cNvPicPr/>
+                  </pic:nvPicPr>
+                  <pic:blipFill>
+                    <a:blip r:embed="rId10"/>
+                    <a:stretch>
+                      <a:fillRect/>
+                    </a:stretch>
+                  </pic:blipFill>
+                  <pic:spPr>
+                    <a:xfrm>
+                      <a:off x="0" y="0"/>
+                      <a:ext cx="13888978" cy="10260000"/>
+                    </a:xfrm>
+                    <a:prstGeom prst="rect"/>
+                  </pic:spPr>
+                </pic:pic>
+              </a:graphicData>
+            </a:graphic>
+          </wp:inline>
+        </w:drawing>
+      </w:r>
+    </w:p>
+    <w:p>
+      <w:pPr>
+        <w:sectPr>
+          <w:pgSz w:w="23811" w:h="16838"/>
+          <w:pgMar w:top="283" w:right="283" w:bottom="283" w:left="283" w:header="170" w:footer="170" w:gutter="0"/>
+          <w:cols w:space="720"/>
+          <w:docGrid w:linePitch="360"/>
+        </w:sectPr>
+      </w:pPr>
+    </w:p>
     <w:p>
       <w:pPr>
         <w:spacing w:after="80"/>
@@ -44,7 +144,7 @@
           <w:color w:val="555555"/>
           <w:sz w:val="22"/>
         </w:rPr>
-        <w:t>课程资源清单（由扫描版 PDF 转换，软件名称统一为 PQArt）</w:t>
+        <w:t>可编辑资源清单（软件名称统一为 PQArt；前两页为原海报版式）</w:t>
       </w:r>
     </w:p>
     <w:p>
@@ -6424,140 +6524,12 @@
           <w:color w:val="666666"/>
           <w:sz w:val="20"/>
         </w:rPr>
-        <w:t>说明：源文件为扫描版海报 PDF（2 页），无可选中文字。本 Word 文档将海报版式还原为可编辑的课程资源清单，软件名称统一为 PQArt。文末附原海报页面，便于对照版式。</w:t>
-      </w:r>
-    </w:p>
-    <w:p>
-      <w:pPr>
-        <w:sectPr>
-          <w:pgSz w:w="11906" w:h="16838"/>
-          <w:pgMar w:top="1020" w:right="1020" w:bottom="1020" w:left="1020" w:header="720" w:footer="720" w:gutter="0"/>
-          <w:cols w:space="720"/>
-          <w:docGrid w:linePitch="360"/>
-        </w:sectPr>
-      </w:pPr>
-    </w:p>
-    <w:p>
-      <w:pPr>
-        <w:spacing w:after="120"/>
-        <w:jc w:val="center"/>
-      </w:pPr>
-      <w:r>
-        <w:rPr>
-          <w:rFonts w:ascii="Calibri" w:hAnsi="Calibri" w:eastAsia="微软雅黑" w:cs="Calibri"/>
-          <w:b w:val="0"/>
-          <w:color w:val="1F5FA8"/>
-          <w:sz w:val="20"/>
-        </w:rPr>
-        <w:t>附图 1  原海报第 1 页（课程概述与第一至四章资源清单）</w:t>
-      </w:r>
-    </w:p>
-    <w:p>
-      <w:pPr>
-        <w:jc w:val="center"/>
-      </w:pPr>
-      <w:r>
-        <w:drawing>
-          <wp:inline xmlns:a="http://schemas.openxmlformats.org/drawingml/2006/main" xmlns:pic="http://schemas.openxmlformats.org/drawingml/2006/picture">
-            <wp:extent cx="12085847" cy="8928000"/>
-            <wp:docPr id="1" name="Picture 1"/>
-            <wp:cNvGraphicFramePr>
-              <a:graphicFrameLocks noChangeAspect="1"/>
-            </wp:cNvGraphicFramePr>
-            <a:graphic>
-              <a:graphicData uri="http://schemas.openxmlformats.org/drawingml/2006/picture">
-                <pic:pic>
-                  <pic:nvPicPr>
-                    <pic:cNvPr id="0" name="page1.jpg"/>
-                    <pic:cNvPicPr/>
-                  </pic:nvPicPr>
-                  <pic:blipFill>
-                    <a:blip r:embed="rId9"/>
-                    <a:stretch>
-                      <a:fillRect/>
-                    </a:stretch>
-                  </pic:blipFill>
-                  <pic:spPr>
-                    <a:xfrm>
-                      <a:off x="0" y="0"/>
-                      <a:ext cx="12085847" cy="8928000"/>
-                    </a:xfrm>
-                    <a:prstGeom prst="rect"/>
-                  </pic:spPr>
-                </pic:pic>
-              </a:graphicData>
-            </a:graphic>
-          </wp:inline>
-        </w:drawing>
-      </w:r>
-    </w:p>
-    <w:p>
-      <w:pPr>
-        <w:sectPr>
-          <w:pgSz w:w="23811" w:h="16838"/>
-          <w:pgMar w:top="680" w:right="680" w:bottom="680" w:left="680" w:header="720" w:footer="720" w:gutter="0"/>
-          <w:cols w:space="720"/>
-          <w:docGrid w:linePitch="360"/>
-        </w:sectPr>
-      </w:pPr>
-    </w:p>
-    <w:p>
-      <w:pPr>
-        <w:spacing w:after="120"/>
-        <w:jc w:val="center"/>
-      </w:pPr>
-      <w:r>
-        <w:rPr>
-          <w:rFonts w:ascii="Calibri" w:hAnsi="Calibri" w:eastAsia="微软雅黑" w:cs="Calibri"/>
-          <w:b w:val="0"/>
-          <w:color w:val="1F5FA8"/>
-          <w:sz w:val="20"/>
-        </w:rPr>
-        <w:t>附图 2  原海报第 2 页（第五章资源清单）</w:t>
-      </w:r>
-    </w:p>
-    <w:p>
-      <w:pPr>
-        <w:jc w:val="center"/>
-      </w:pPr>
-      <w:r>
-        <w:drawing>
-          <wp:inline xmlns:a="http://schemas.openxmlformats.org/drawingml/2006/main" xmlns:pic="http://schemas.openxmlformats.org/drawingml/2006/picture">
-            <wp:extent cx="12085847" cy="8928000"/>
-            <wp:docPr id="2" name="Picture 2"/>
-            <wp:cNvGraphicFramePr>
-              <a:graphicFrameLocks noChangeAspect="1"/>
-            </wp:cNvGraphicFramePr>
-            <a:graphic>
-              <a:graphicData uri="http://schemas.openxmlformats.org/drawingml/2006/picture">
-                <pic:pic>
-                  <pic:nvPicPr>
-                    <pic:cNvPr id="0" name="page2.jpg"/>
-                    <pic:cNvPicPr/>
-                  </pic:nvPicPr>
-                  <pic:blipFill>
-                    <a:blip r:embed="rId10"/>
-                    <a:stretch>
-                      <a:fillRect/>
-                    </a:stretch>
-                  </pic:blipFill>
-                  <pic:spPr>
-                    <a:xfrm>
-                      <a:off x="0" y="0"/>
-                      <a:ext cx="12085847" cy="8928000"/>
-                    </a:xfrm>
-                    <a:prstGeom prst="rect"/>
-                  </pic:spPr>
-                </pic:pic>
-              </a:graphicData>
-            </a:graphic>
-          </wp:inline>
-        </w:drawing>
+        <w:t>说明：源文件为扫描版海报 PDF（2 页），无可选中文字。Word 文档前两页保留原海报版式，后续页面为可编辑的课程资源清单，软件名称统一为 PQArt。</w:t>
       </w:r>
     </w:p>
     <w:sectPr>
-      <w:pgSz w:w="23811" w:h="16838"/>
-      <w:pgMar w:top="680" w:right="680" w:bottom="680" w:left="680" w:header="720" w:footer="720" w:gutter="0"/>
+      <w:pgSz w:w="11906" w:h="16838"/>
+      <w:pgMar w:top="1020" w:right="1020" w:bottom="1020" w:left="1020" w:header="170" w:footer="170" w:gutter="0"/>
       <w:cols w:space="720"/>
       <w:docGrid w:linePitch="360"/>
     </w:sectPr>

</xml_diff>